<commit_message>
App Store 1.4.1 compliance, lexicon sweep, feeling check-in, and business brief
- Rewrite all 17 remedy steps as third-person cultural narratives (1.4.1 compliance)
- Add general reference disclaimer footer to RemedyDetailScreen
- Retire "cleanse/detox" lexicon across UI and copy; rename to Protocol Journal
- Add feeling check-in chips to JournalScreen with dayFeelings persistence
- Fix onboarding spinner with fire-and-forget Firestore submit pattern
- Refactor Settings/OurStoryView to NavigationLink push with forest nav bar
- Expand RemedyDatabase to 17 remedies (6 new Phase 2 entries)
- Update PRD, TechSpec, and DesignGuide to reflect all session changes
- Add 09_BusinessBrief.docx internal strategy document

Co-Authored-By: Claude Sonnet 4.6 <noreply@anthropic.com>
</commit_message>
<xml_diff>
--- a/remedy_app_documents/01_PRD.docx
+++ b/remedy_app_documents/01_PRD.docx
@@ -148,7 +148,7 @@
           <w:sz w:val="20"/>
           <w:szCs w:val="20"/>
         </w:rPr>
-        <w:t xml:space="preserve">Herbal Remedy Advisor is a multicultural health companion iOS app that helps users identify natural anti-parasite and cleanse remedies drawn from Eastern, African, Latin American, Persian, and European healing traditions. The app bridges a gap in US health culture by surfacing ancient healing knowledge from cultures that have long practiced preventive cleansing protocols.</w:t>
+        <w:t xml:space="preserve">Herbal Remedy Advisor (Nise) is a multicultural health companion iOS app that helps users discover traditional herbal remedy protocols drawn from Eastern, African, Latin American, Persian, and European healing traditions. The app bridges a gap in US health culture by surfacing ancient healing knowledge from cultures that have long practiced preventive, plant-based wellness protocols. All content is framed as educational cultural archival material — not medical instruction — in full compliance with App Store Guideline 1.4.1.</w:t>
       </w:r>
     </w:p>
     <w:p>
@@ -1535,7 +1535,7 @@
                 <w:sz w:val="18"/>
                 <w:szCs w:val="18"/>
               </w:rPr>
-              <w:t xml:space="preserve">Cleanse Journal</w:t>
+              <w:t xml:space="preserve">Protocol Journal</w:t>
             </w:r>
           </w:p>
         </w:tc>
@@ -2656,7 +2656,7 @@
           <w:sz w:val="20"/>
           <w:szCs w:val="20"/>
         </w:rPr>
-        <w:t xml:space="preserve">Begin N-Day Cleanse Journal CTA button</w:t>
+        <w:t xml:space="preserve">Begin N-Day Protocol CTA button</w:t>
       </w:r>
     </w:p>
     <w:p>
@@ -3495,7 +3495,7 @@
           <w:sz w:val="26"/>
           <w:szCs w:val="26"/>
         </w:rPr>
-        <w:t xml:space="preserve">3.5 Cleanse Journal Screen</w:t>
+        <w:t xml:space="preserve">3.5 Protocol Journal Screen</w:t>
       </w:r>
     </w:p>
     <w:p>
@@ -6228,7 +6228,7 @@
           <w:sz w:val="18"/>
           <w:szCs w:val="18"/>
         </w:rPr>
-        <w:t xml:space="preserve">  taskChecked: [Bool]         // per-step checkbox states for today</w:t>
+        <w:t xml:space="preserve">  taskChecked: [Bool]         // per-step checkbox states for today (read-only display; toggled internally)</w:t>
       </w:r>
     </w:p>
     <w:p>
@@ -6245,6 +6245,22 @@
           <w:szCs w:val="18"/>
         </w:rPr>
         <w:t xml:space="preserve">  protocolStartDate: Date     // calendar anchor for day 1</w:t>
+      </w:r>
+    </w:p>
+    <w:p>
+      <w:pPr>
+        <w:shd w:fill="F0EDE8" w:val="clear"/>
+        <w:spacing w:after="80" w:before="80"/>
+        <w:ind w:left="360"/>
+      </w:pPr>
+      <w:r>
+        <w:rPr>
+          <w:rFonts w:ascii="Courier New" w:cs="Courier New" w:eastAsia="Courier New" w:hAnsi="Courier New"/>
+          <w:color w:val="2E5C2E"/>
+          <w:sz w:val="18"/>
+          <w:szCs w:val="18"/>
+        </w:rPr>
+        <w:t xml:space="preserve">  dayFeelings: [Int: String]  // per-day feeling log; key = day number, value = "better" | "same" | "noticed"</w:t>
       </w:r>
     </w:p>
     <w:p>
@@ -6698,7 +6714,7 @@
                 <w:sz w:val="18"/>
                 <w:szCs w:val="18"/>
               </w:rPr>
-              <w:t xml:space="preserve">Cleanse Journal Screen</w:t>
+              <w:t xml:space="preserve">Protocol Journal Screen</w:t>
             </w:r>
           </w:p>
         </w:tc>
@@ -7007,7 +7023,7 @@
           <w:sz w:val="20"/>
           <w:szCs w:val="20"/>
         </w:rPr>
-        <w:t xml:space="preserve">All 11 remedies below are frozen. No remedies are to be added or removed from v1.0 without product sign-off.</w:t>
+        <w:t xml:space="preserve">17 remedy protocols are documented below across 6 healing traditions. The original 11 are the frozen v1.0 core; 6 additional remedies (3 African Herbalism, 2 Persian/Unani, 1 additional European) were added in Phase 2. All steps are written as third-person past-tense cultural narratives per App Store Guideline 1.4.1 compliance.</w:t>
       </w:r>
     </w:p>
     <w:p>
@@ -7377,6 +7393,133 @@
       </w:r>
     </w:p>
     <w:p>
+      <w:pPr>
+        <w:pStyle w:val="Heading2"/>
+        <w:spacing w:after="80" w:before="200"/>
+      </w:pPr>
+      <w:r>
+        <w:rPr>
+          <w:rFonts w:ascii="Arial" w:cs="Arial" w:eastAsia="Arial" w:hAnsi="Arial"/>
+          <w:b/>
+          <w:color w:val="1A2E1A"/>
+          <w:sz w:val="28"/>
+          <w:szCs w:val="28"/>
+        </w:rPr>
+        <w:t xml:space="preserve">African Herbalism (Sub-Saharan Africa) — Phase 2</w:t>
+      </w:r>
+    </w:p>
+    <w:p>
+      <w:pPr>
+        <w:pStyle w:val="ListParagraph"/>
+        <w:numPr>
+          <w:ilvl w:val="0"/>
+          <w:numId w:val="2"/>
+        </w:numPr>
+        <w:spacing w:after="60"/>
+      </w:pPr>
+      <w:r>
+        <w:rPr>
+          <w:rFonts w:ascii="Arial" w:cs="Arial" w:eastAsia="Arial" w:hAnsi="Arial"/>
+          <w:color w:val="000000"/>
+          <w:sz w:val="20"/>
+          <w:szCs w:val="20"/>
+        </w:rPr>
+        <w:t xml:space="preserve">Moringa &amp; Baobab Vitality Tonic — 21-day protocol. Symptoms: Fatigue, Appetite Loss.</w:t>
+      </w:r>
+    </w:p>
+    <w:p>
+      <w:pPr>
+        <w:pStyle w:val="ListParagraph"/>
+        <w:numPr>
+          <w:ilvl w:val="0"/>
+          <w:numId w:val="2"/>
+        </w:numPr>
+        <w:spacing w:after="60"/>
+      </w:pPr>
+      <w:r>
+        <w:rPr>
+          <w:rFonts w:ascii="Arial" w:cs="Arial" w:eastAsia="Arial" w:hAnsi="Arial"/>
+          <w:color w:val="000000"/>
+          <w:sz w:val="20"/>
+          <w:szCs w:val="20"/>
+        </w:rPr>
+        <w:t xml:space="preserve">Rooibos &amp; Buchu Digestive Brew — 14-day protocol. Symptoms: Digestive Issues, Bloating &amp; Gas.</w:t>
+      </w:r>
+    </w:p>
+    <w:p>
+      <w:pPr>
+        <w:pStyle w:val="ListParagraph"/>
+        <w:numPr>
+          <w:ilvl w:val="0"/>
+          <w:numId w:val="2"/>
+        </w:numPr>
+        <w:spacing w:after="60"/>
+      </w:pPr>
+      <w:r>
+        <w:rPr>
+          <w:rFonts w:ascii="Arial" w:cs="Arial" w:eastAsia="Arial" w:hAnsi="Arial"/>
+          <w:color w:val="000000"/>
+          <w:sz w:val="20"/>
+          <w:szCs w:val="20"/>
+        </w:rPr>
+        <w:t xml:space="preserve">Grains of Paradise Digestive Tonic — 14-day protocol. Symptoms: Digestive Issues, Sugar Cravings.</w:t>
+      </w:r>
+    </w:p>
+    <w:p>
+      <w:pPr>
+        <w:pStyle w:val="Heading2"/>
+        <w:spacing w:after="80" w:before="200"/>
+      </w:pPr>
+      <w:r>
+        <w:rPr>
+          <w:rFonts w:ascii="Arial" w:cs="Arial" w:eastAsia="Arial" w:hAnsi="Arial"/>
+          <w:b/>
+          <w:color w:val="1A2E1A"/>
+          <w:sz w:val="28"/>
+          <w:szCs w:val="28"/>
+        </w:rPr>
+        <w:t xml:space="preserve">Persian/Unani Medicine (Iran) — Phase 2</w:t>
+      </w:r>
+    </w:p>
+    <w:p>
+      <w:pPr>
+        <w:pStyle w:val="ListParagraph"/>
+        <w:numPr>
+          <w:ilvl w:val="0"/>
+          <w:numId w:val="2"/>
+        </w:numPr>
+        <w:spacing w:after="60"/>
+      </w:pPr>
+      <w:r>
+        <w:rPr>
+          <w:rFonts w:ascii="Arial" w:cs="Arial" w:eastAsia="Arial" w:hAnsi="Arial"/>
+          <w:color w:val="000000"/>
+          <w:sz w:val="20"/>
+          <w:szCs w:val="20"/>
+        </w:rPr>
+        <w:t xml:space="preserve">Saffron &amp; Rhodiola Adaptogen Blend — 21-day protocol. Symptoms: Mood Changes, Fatigue.</w:t>
+      </w:r>
+    </w:p>
+    <w:p>
+      <w:pPr>
+        <w:pStyle w:val="ListParagraph"/>
+        <w:numPr>
+          <w:ilvl w:val="0"/>
+          <w:numId w:val="2"/>
+        </w:numPr>
+        <w:spacing w:after="60"/>
+      </w:pPr>
+      <w:r>
+        <w:rPr>
+          <w:rFonts w:ascii="Arial" w:cs="Arial" w:eastAsia="Arial" w:hAnsi="Arial"/>
+          <w:color w:val="000000"/>
+          <w:sz w:val="20"/>
+          <w:szCs w:val="20"/>
+        </w:rPr>
+        <w:t xml:space="preserve">Black Seed Honey Elixir — 21-day protocol. Symptoms: Joint Discomfort, Skin Irritation.</w:t>
+      </w:r>
+    </w:p>
+    <w:p>
       <w:r>
         <w:br w:type="page"/>
       </w:r>
@@ -7450,7 +7593,7 @@
           <w:sz w:val="20"/>
           <w:szCs w:val="20"/>
         </w:rPr>
-        <w:t xml:space="preserve">These remedies are based on traditional practices from various healing cultures. They are not intended to diagnose, treat, cure, or prevent any medical condition. Always consult a qualified, licensed healthcare provider before beginning any herbal cleanse or protocol — especially if pregnant, nursing, taking medication, or managing a health condition.</w:t>
+        <w:t xml:space="preserve">The sources and preparation methods documented here are provided for educational and cultural archival purposes only. They do not constitute medical advice, diagnosis, or treatment. Always consult a qualified healthcare provider before beginning any herbal protocol or regimen — especially if pregnant, nursing, taking medication, or managing a health condition.</w:t>
       </w:r>
     </w:p>
     <w:p>

</xml_diff>

<commit_message>
Firebase backend: Firestore seeded, rules deployed, docs updated
- seed_firestore.js: idempotent Admin SDK script seeding 17 /protocols/
  documents and /app_strings/global_config (dry-run mode, auto-resolves
  global firebase-admin)
- storage.rules: authenticated read on /protocols/**, owner-only on
  /users/{uid}/**, default deny
- firestore.indexes.json: empty index scaffold
- 01_PRD.docx: section 9 Firebase + Monetization Architecture added;
  auth, cloud sync, and IAP marked moved-in-scope in section 8
- 02_TechSpec.docx: Firebase SDK + StoreKit 2 added to stack table;
  section 13 Firebase Backend Architecture added (project config,
  Firestore data model, FetchState machine, new VMs/Views, security
  rules, infra files)
- 03_DesignGuide.docx: section 6 Phase 3 Component Specifications added
  (shimmer skeleton, ProtocolDetailView layout, Archive Unavailable
  banner, dynamic systemPriority chips)

Co-Authored-By: Claude Sonnet 4.6 <noreply@anthropic.com>
</commit_message>
<xml_diff>
--- a/remedy_app_documents/01_PRD.docx
+++ b/remedy_app_documents/01_PRD.docx
@@ -7749,30 +7749,30 @@
           <w:sz w:val="20"/>
           <w:szCs w:val="20"/>
         </w:rPr>
-        <w:t xml:space="preserve">User accounts / authentication</w:t>
-      </w:r>
-    </w:p>
-    <w:p>
-      <w:pPr>
-        <w:pStyle w:val="ListParagraph"/>
-        <w:numPr>
-          <w:ilvl w:val="0"/>
-          <w:numId w:val="2"/>
-        </w:numPr>
-        <w:spacing w:after="60"/>
-      </w:pPr>
-      <w:r>
-        <w:rPr>
-          <w:rFonts w:ascii="Arial" w:cs="Arial" w:eastAsia="Arial" w:hAnsi="Arial"/>
-          <w:b w:val="false"/>
-          <w:bCs w:val="false"/>
-          <w:i w:val="false"/>
-          <w:iCs w:val="false"/>
-          <w:color w:val="000000"/>
-          <w:sz w:val="20"/>
-          <w:szCs w:val="20"/>
-        </w:rPr>
-        <w:t xml:space="preserve">Cloud sync of journal data</w:t>
+        <w:t xml:space="preserve">User accounts / authentication [MOVED IN SCOPE — Firebase Auth implemented]</w:t>
+      </w:r>
+    </w:p>
+    <w:p>
+      <w:pPr>
+        <w:pStyle w:val="ListParagraph"/>
+        <w:numPr>
+          <w:ilvl w:val="0"/>
+          <w:numId w:val="2"/>
+        </w:numPr>
+        <w:spacing w:after="60"/>
+      </w:pPr>
+      <w:r>
+        <w:rPr>
+          <w:rFonts w:ascii="Arial" w:cs="Arial" w:eastAsia="Arial" w:hAnsi="Arial"/>
+          <w:b w:val="false"/>
+          <w:bCs w:val="false"/>
+          <w:i w:val="false"/>
+          <w:iCs w:val="false"/>
+          <w:color w:val="000000"/>
+          <w:sz w:val="20"/>
+          <w:szCs w:val="20"/>
+        </w:rPr>
+        <w:t xml:space="preserve">Cloud sync of journal data [MOVED IN SCOPE — Firestore /users/{uid}/journal/ sub-collection]</w:t>
       </w:r>
     </w:p>
     <w:p>
@@ -7956,7 +7956,7 @@
           <w:sz w:val="20"/>
           <w:szCs w:val="20"/>
         </w:rPr>
-        <w:t xml:space="preserve">In-app purchases or subscription paywall</w:t>
+        <w:t xml:space="preserve">In-app purchases or subscription paywall [MOVED IN SCOPE — StoreKit 2 Non-Consumable: nys.lifetime.archive.unlock at $19.99; protocol lock gate implemented]</w:t>
       </w:r>
     </w:p>
     <w:p>
@@ -8026,6 +8026,100 @@
           <w:szCs w:val="20"/>
         </w:rPr>
         <w:t xml:space="preserve">Photo logging of preparations</w:t>
+      </w:r>
+    </w:p>
+    <w:p>
+      <w:pPr>
+        <w:pStyle w:val="Heading1"/>
+        <w:spacing w:after="120" w:before="360"/>
+      </w:pPr>
+      <w:r>
+        <w:rPr>
+          <w:rFonts w:ascii="Arial" w:cs="Arial" w:eastAsia="Arial" w:hAnsi="Arial"/>
+          <w:color w:val="1A2E1A"/>
+        </w:rPr>
+        <w:t xml:space="preserve">9. Firebase + Monetization Architecture (Phase 3)</w:t>
+      </w:r>
+    </w:p>
+    <w:p>
+      <w:pPr>
+        <w:spacing w:after="60"/>
+      </w:pPr>
+      <w:r>
+        <w:rPr>
+          <w:rFonts w:ascii="Arial" w:cs="Arial" w:eastAsia="Arial" w:hAnsi="Arial"/>
+          <w:b/>
+          <w:sz w:val="20"/>
+          <w:szCs w:val="20"/>
+        </w:rPr>
+        <w:t xml:space="preserve">Backend</w:t>
+      </w:r>
+    </w:p>
+    <w:p>
+      <w:pPr>
+        <w:spacing w:after="60"/>
+      </w:pPr>
+      <w:r>
+        <w:rPr>
+          <w:rFonts w:ascii="Arial" w:cs="Arial" w:eastAsia="Arial" w:hAnsi="Arial"/>
+          <w:sz w:val="20"/>
+          <w:szCs w:val="20"/>
+        </w:rPr>
+        <w:t xml:space="preserve">Firebase project nise-e483f (Blaze plan, us-central1). Firestore production database seeded with 17 /protocols/ documents and /app_strings/global_config. Security rules deployed: ABAC Firestore rules (v2) with noMonetizationEscalation() guard; Storage rules with authenticated-read on /protocols/** and owner-only on /users/{uid}/**.</w:t>
+      </w:r>
+    </w:p>
+    <w:p>
+      <w:pPr>
+        <w:spacing w:after="60"/>
+      </w:pPr>
+      <w:r>
+        <w:rPr>
+          <w:rFonts w:ascii="Arial" w:cs="Arial" w:eastAsia="Arial" w:hAnsi="Arial"/>
+          <w:b/>
+          <w:sz w:val="20"/>
+          <w:szCs w:val="20"/>
+        </w:rPr>
+        <w:t xml:space="preserve">Monetization</w:t>
+      </w:r>
+    </w:p>
+    <w:p>
+      <w:pPr>
+        <w:spacing w:after="60"/>
+      </w:pPr>
+      <w:r>
+        <w:rPr>
+          <w:rFonts w:ascii="Arial" w:cs="Arial" w:eastAsia="Arial" w:hAnsi="Arial"/>
+          <w:sz w:val="20"/>
+          <w:szCs w:val="20"/>
+        </w:rPr>
+        <w:t xml:space="preserve">StoreKit 2 Non-Consumable IAP: nys.lifetime.archive.unlock at $19.99. Starter volume: 3 protocols accessible without purchase (starterVolumeProtocolLimit in /app_strings/global_config). Protocol lock gate (.protocolLockGate() modifier) implemented on ProtocolDetailView and RemedyDetailScreen. isLifetimeArchiveUnlocked and availableTokens fields managed exclusively by Admin SDK — client writes blocked by Firestore rule. App Store Connect IAP creation deferred to pre-TestFlight submission.</w:t>
+      </w:r>
+    </w:p>
+    <w:p>
+      <w:pPr>
+        <w:spacing w:after="60"/>
+      </w:pPr>
+      <w:r>
+        <w:rPr>
+          <w:rFonts w:ascii="Arial" w:cs="Arial" w:eastAsia="Arial" w:hAnsi="Arial"/>
+          <w:b/>
+          <w:sz w:val="20"/>
+          <w:szCs w:val="20"/>
+        </w:rPr>
+        <w:t xml:space="preserve">Dynamic Protocol Detail</w:t>
+      </w:r>
+    </w:p>
+    <w:p>
+      <w:pPr>
+        <w:spacing w:after="60"/>
+      </w:pPr>
+      <w:r>
+        <w:rPr>
+          <w:rFonts w:ascii="Arial" w:cs="Arial" w:eastAsia="Arial" w:hAnsi="Arial"/>
+          <w:sz w:val="20"/>
+          <w:szCs w:val="20"/>
+        </w:rPr>
+        <w:t xml:space="preserve">ResultsScreen now navigates to ProtocolDetailView which fetches live Firestore data. Three rendered states: shimmer skeleton while loading, full remote content on success (historicalContext, systemPriority badge, ingredientDetails, citations), local-fallback + “Archive Unavailable” error banner on failure. Filter chips on ResultsScreen are derived dynamically from live Firestore systemPriority strings — zero hardcoded enum mapping client-side.</w:t>
       </w:r>
     </w:p>
     <w:sectPr>

</xml_diff>